<commit_message>
debugged generation of dim-fact tables, created dashboard in PowerBI
</commit_message>
<xml_diff>
--- a/Misc/KPI metrics.docx
+++ b/Misc/KPI metrics.docx
@@ -78,6 +78,7 @@
           <w:rFonts w:cs="Times New Roman"/>
           <w:b/>
           <w:bCs/>
+          <w:noProof/>
           <w:sz w:val="36"/>
           <w:szCs w:val="36"/>
         </w:rPr>
@@ -308,15 +309,7 @@
           <w:color w:val="000000" w:themeColor="text1"/>
           <w:highlight w:val="yellow"/>
         </w:rPr>
-        <w:t>Month</w:t>
-      </w:r>
-      <w:r>
-        <w:rPr>
-          <w:rFonts w:ascii="Aptos" w:eastAsia="Aptos" w:hAnsi="Aptos" w:cs="Aptos"/>
-          <w:color w:val="000000" w:themeColor="text1"/>
-          <w:highlight w:val="yellow"/>
-        </w:rPr>
-        <w:t xml:space="preserve">ly ATV = </w:t>
+        <w:t xml:space="preserve">Monthly ATV = </w:t>
       </w:r>
       <w:r>
         <w:rPr>
@@ -574,23 +567,7 @@
           <w:rFonts w:ascii="Aptos" w:eastAsia="Aptos" w:hAnsi="Aptos" w:cs="Aptos"/>
           <w:color w:val="000000" w:themeColor="text1"/>
         </w:rPr>
-        <w:t xml:space="preserve">Average profit margin is how much of overall sales revenue results in profits and is an important financial KPI. It’s calculated by subtracting the costs associated with producing the company’s goods and services from sales revenue. Companies can also analyze profit margins generated by specific products, sales territories and salespeople. Businesses with a wide range of products or services should monitor profit margins closely, as should companies that allow their sales reps flexibility in setting prices. This can be monitored </w:t>
-      </w:r>
-      <w:proofErr w:type="gramStart"/>
-      <w:r>
-        <w:rPr>
-          <w:rFonts w:ascii="Aptos" w:eastAsia="Aptos" w:hAnsi="Aptos" w:cs="Aptos"/>
-          <w:color w:val="000000" w:themeColor="text1"/>
-        </w:rPr>
-        <w:t>for overall</w:t>
-      </w:r>
-      <w:proofErr w:type="gramEnd"/>
-      <w:r>
-        <w:rPr>
-          <w:rFonts w:ascii="Aptos" w:eastAsia="Aptos" w:hAnsi="Aptos" w:cs="Aptos"/>
-          <w:color w:val="000000" w:themeColor="text1"/>
-        </w:rPr>
-        <w:t xml:space="preserve"> average profit margin or for specific areas. The formula for average profit margin is:</w:t>
+        <w:t>Average profit margin is how much of overall sales revenue results in profits and is an important financial KPI. It’s calculated by subtracting the costs associated with producing the company’s goods and services from sales revenue. Companies can also analyze profit margins generated by specific products, sales territories and salespeople. Businesses with a wide range of products or services should monitor profit margins closely, as should companies that allow their sales reps flexibility in setting prices. This can be monitored for overall average profit margin or for specific areas. The formula for average profit margin is:</w:t>
       </w:r>
     </w:p>
     <w:p>
@@ -610,7 +587,7 @@
           <w:color w:val="000000" w:themeColor="text1"/>
           <w:highlight w:val="yellow"/>
         </w:rPr>
-        <w:t xml:space="preserve">Daily/Monthly/Annual </w:t>
+        <w:t xml:space="preserve">Annual </w:t>
       </w:r>
       <w:r>
         <w:rPr>
@@ -628,25 +605,39 @@
           <w:color w:val="000000" w:themeColor="text1"/>
           <w:highlight w:val="yellow"/>
         </w:rPr>
-        <w:t xml:space="preserve"> (Net income / net </w:t>
+        <w:t xml:space="preserve"> (Net </w:t>
       </w:r>
-      <w:proofErr w:type="gramStart"/>
       <w:r>
         <w:rPr>
           <w:rFonts w:ascii="Aptos" w:eastAsia="Aptos" w:hAnsi="Aptos" w:cs="Aptos"/>
           <w:color w:val="000000" w:themeColor="text1"/>
           <w:highlight w:val="yellow"/>
         </w:rPr>
-        <w:t>sales )</w:t>
+        <w:t>profit</w:t>
       </w:r>
-      <w:proofErr w:type="gramEnd"/>
       <w:r>
         <w:rPr>
           <w:rFonts w:ascii="Aptos" w:eastAsia="Aptos" w:hAnsi="Aptos" w:cs="Aptos"/>
           <w:color w:val="000000" w:themeColor="text1"/>
           <w:highlight w:val="yellow"/>
         </w:rPr>
-        <w:t xml:space="preserve"> X 100</w:t>
+        <w:t xml:space="preserve">/ </w:t>
+      </w:r>
+      <w:r>
+        <w:rPr>
+          <w:rFonts w:ascii="Aptos" w:eastAsia="Aptos" w:hAnsi="Aptos" w:cs="Aptos"/>
+          <w:color w:val="000000" w:themeColor="text1"/>
+          <w:highlight w:val="yellow"/>
+        </w:rPr>
+        <w:t>total revenue</w:t>
+      </w:r>
+      <w:r>
+        <w:rPr>
+          <w:rFonts w:ascii="Aptos" w:eastAsia="Aptos" w:hAnsi="Aptos" w:cs="Aptos"/>
+          <w:color w:val="000000" w:themeColor="text1"/>
+          <w:highlight w:val="yellow"/>
+        </w:rPr>
+        <w:t xml:space="preserve"> ) X 100</w:t>
       </w:r>
     </w:p>
     <w:p>
@@ -762,15 +753,7 @@
           <w:color w:val="000000" w:themeColor="text1"/>
           <w:highlight w:val="yellow"/>
         </w:rPr>
-        <w:t xml:space="preserve">Monthly </w:t>
-      </w:r>
-      <w:r>
-        <w:rPr>
-          <w:rFonts w:ascii="Aptos" w:eastAsia="Aptos" w:hAnsi="Aptos" w:cs="Aptos"/>
-          <w:color w:val="000000" w:themeColor="text1"/>
-          <w:highlight w:val="yellow"/>
-        </w:rPr>
-        <w:t>product performance (which was the best revenue) *</w:t>
+        <w:t>Monthly product performance (which was the best revenue) *</w:t>
       </w:r>
     </w:p>
     <w:p>
@@ -793,15 +776,7 @@
           <w:color w:val="000000" w:themeColor="text1"/>
           <w:highlight w:val="yellow"/>
         </w:rPr>
-        <w:t xml:space="preserve">Monthly </w:t>
-      </w:r>
-      <w:r>
-        <w:rPr>
-          <w:rFonts w:ascii="Aptos" w:eastAsia="Aptos" w:hAnsi="Aptos" w:cs="Aptos"/>
-          <w:color w:val="000000" w:themeColor="text1"/>
-          <w:highlight w:val="yellow"/>
-        </w:rPr>
-        <w:t>product performance (which was the best profit) *</w:t>
+        <w:t>Monthly product performance (which was the best profit) *</w:t>
       </w:r>
     </w:p>
     <w:p>
@@ -824,15 +799,7 @@
           <w:color w:val="000000" w:themeColor="text1"/>
           <w:highlight w:val="yellow"/>
         </w:rPr>
-        <w:t xml:space="preserve">Annual </w:t>
-      </w:r>
-      <w:r>
-        <w:rPr>
-          <w:rFonts w:ascii="Aptos" w:eastAsia="Aptos" w:hAnsi="Aptos" w:cs="Aptos"/>
-          <w:color w:val="000000" w:themeColor="text1"/>
-          <w:highlight w:val="yellow"/>
-        </w:rPr>
-        <w:t>product performance (which was the best revenue) *</w:t>
+        <w:t>Annual product performance (which was the best revenue) *</w:t>
       </w:r>
     </w:p>
     <w:p>
@@ -855,15 +822,7 @@
           <w:color w:val="000000" w:themeColor="text1"/>
           <w:highlight w:val="yellow"/>
         </w:rPr>
-        <w:t xml:space="preserve">Annual </w:t>
-      </w:r>
-      <w:r>
-        <w:rPr>
-          <w:rFonts w:ascii="Aptos" w:eastAsia="Aptos" w:hAnsi="Aptos" w:cs="Aptos"/>
-          <w:color w:val="000000" w:themeColor="text1"/>
-          <w:highlight w:val="yellow"/>
-        </w:rPr>
-        <w:t>product performance (which was the best profit) *</w:t>
+        <w:t>Annual product performance (which was the best profit) *</w:t>
       </w:r>
     </w:p>
     <w:p>
@@ -916,23 +875,7 @@
           <w:rFonts w:ascii="Aptos" w:eastAsia="Aptos" w:hAnsi="Aptos" w:cs="Aptos"/>
           <w:color w:val="000000" w:themeColor="text1"/>
         </w:rPr>
-        <w:t xml:space="preserve"> Retention rate measures the proportion of existing customers who continue purchasing from you </w:t>
-      </w:r>
-      <w:proofErr w:type="gramStart"/>
-      <w:r>
-        <w:rPr>
-          <w:rFonts w:ascii="Aptos" w:eastAsia="Aptos" w:hAnsi="Aptos" w:cs="Aptos"/>
-          <w:color w:val="000000" w:themeColor="text1"/>
-        </w:rPr>
-        <w:t>over time</w:t>
-      </w:r>
-      <w:proofErr w:type="gramEnd"/>
-      <w:r>
-        <w:rPr>
-          <w:rFonts w:ascii="Aptos" w:eastAsia="Aptos" w:hAnsi="Aptos" w:cs="Aptos"/>
-          <w:color w:val="000000" w:themeColor="text1"/>
-        </w:rPr>
-        <w:t>:</w:t>
+        <w:t> Retention rate measures the proportion of existing customers who continue purchasing from you over time:</w:t>
       </w:r>
     </w:p>
     <w:p>
@@ -6198,6 +6141,7 @@
   <w:style w:type="character" w:default="1" w:styleId="DefaultParagraphFont">
     <w:name w:val="Default Paragraph Font"/>
     <w:uiPriority w:val="1"/>
+    <w:semiHidden/>
     <w:unhideWhenUsed/>
   </w:style>
   <w:style w:type="table" w:default="1" w:styleId="TableNormal">

</xml_diff>